<commit_message>
GPC/OSW: fechar gaps GAP_2 linhas 44, 49, 50 e 54
- REG-GPC-002: plano de implementação das 11 OMs + 8 tarefas documentais do
  ciclo MPS-SW (GPC 5, GPC 6) — com tabela Jira-like e CSV espelho em _interno/
- PLA-CAP-001 v1.2: §6.1 com orçamento MPS-SW Nível C (R$22.000 ASR +
  R$6.861 SOFTEX + R$3.500 consultoria = R$32.361) — OSW 2
- ATA-GPC-001: ata da reunião TMC de 11/06/2026 — análise crítica de OMs,
  aprovação do plano de implementação e comunicação estruturada por grupo/canal
  (GPC 6, GPC 7, OSW 3)
- REG-OSW-002: registro de comunicação formal da POL-ORG-001 pela alta gestão
  (kickoff 07/07/2025 + análise crítica jun/2026) — OSW 1, OSW 7

https://claude.ai/code/session_011KXfcc9u9SbkrrmomU4zNq
</commit_message>
<xml_diff>
--- a/mps-nivel-c/oficial/01_apoio/PLA-CAP-001_Plano-de-Capacitacao.docx
+++ b/mps-nivel-c/oficial/01_apoio/PLA-CAP-001_Plano-de-Capacitacao.docx
@@ -34,7 +34,7 @@
           <w:color w:val="555555"/>
           <w:sz w:val="20"/>
         </w:rPr>
-        <w:t>PLA-CAP-001   ·   Versão Data   ·   10/02/2026   ·   Timeware Brasil</w:t>
+        <w:t>PLA-CAP-001   ·   Versão Data   ·   13/06/2026   ·   Timeware Brasil</w:t>
       </w:r>
     </w:p>
     <w:p>
@@ -226,7 +226,7 @@
                 <w:i w:val="0"/>
                 <w:sz w:val="20"/>
               </w:rPr>
-              <w:t>1.1</w:t>
+              <w:t>1.2</w:t>
             </w:r>
           </w:p>
         </w:tc>
@@ -282,7 +282,7 @@
                 <w:i w:val="0"/>
                 <w:sz w:val="20"/>
               </w:rPr>
-              <w:t>10/02/2026</w:t>
+              <w:t>13/06/2026</w:t>
             </w:r>
           </w:p>
         </w:tc>
@@ -1653,6 +1653,16 @@
     </w:p>
     <w:p>
       <w:pPr>
+        <w:pStyle w:val="Heading2"/>
+        <w:keepNext/>
+        <w:keepLines/>
+      </w:pPr>
+      <w:r>
+        <w:t>6.1. Orçamento do ciclo MPS-SW Nível C (2025–2026)</w:t>
+      </w:r>
+    </w:p>
+    <w:p>
+      <w:pPr>
         <w:spacing w:before="0" w:after="120"/>
       </w:pPr>
       <w:r>
@@ -1662,7 +1672,462 @@
           <w:i w:val="0"/>
           <w:sz w:val="22"/>
         </w:rPr>
-        <w:t>A manutenção desses recursos é responsabilidade da área de Cultura e Pessoas, com apoio do COO.</w:t>
+        <w:t>Para o ciclo de implantação e avaliação MPS-SW Nível C, foram previstas e aprovadas pelo COO as seguintes despesas:</w:t>
+      </w:r>
+    </w:p>
+    <w:tbl>
+      <w:tblPr>
+        <w:tblW w:type="auto" w:w="0"/>
+        <w:tblLook w:firstColumn="1" w:firstRow="1" w:lastColumn="0" w:lastRow="0" w:noHBand="0" w:noVBand="1" w:val="04A0"/>
+        <w:tblBorders>
+          <w:top w:val="single" w:sz="4" w:space="0" w:color="003366"/>
+          <w:left w:val="single" w:sz="4" w:space="0" w:color="003366"/>
+          <w:bottom w:val="single" w:sz="4" w:space="0" w:color="003366"/>
+          <w:right w:val="single" w:sz="4" w:space="0" w:color="003366"/>
+          <w:insideH w:val="single" w:sz="4" w:space="0" w:color="003366"/>
+          <w:insideV w:val="single" w:sz="4" w:space="0" w:color="003366"/>
+        </w:tblBorders>
+      </w:tblPr>
+      <w:tblGrid>
+        <w:gridCol w:w="2967"/>
+        <w:gridCol w:w="2967"/>
+        <w:gridCol w:w="2967"/>
+      </w:tblGrid>
+      <w:tr>
+        <w:trPr>
+          <w:cantSplit w:val="1"/>
+        </w:trPr>
+        <w:tc>
+          <w:tcPr>
+            <w:tcW w:type="dxa" w:w="2967"/>
+            <w:tcMar>
+              <w:top w:w="60" w:type="dxa"/>
+              <w:bottom w:w="60" w:type="dxa"/>
+              <w:left w:w="100" w:type="dxa"/>
+              <w:right w:w="100" w:type="dxa"/>
+            </w:tcMar>
+            <w:shd w:val="clear" w:color="auto" w:fill="003366"/>
+          </w:tcPr>
+          <w:p>
+            <w:pPr>
+              <w:spacing w:before="40" w:after="40"/>
+            </w:pPr>
+            <w:r>
+              <w:rPr>
+                <w:rFonts w:ascii="Calibri" w:hAnsi="Calibri"/>
+                <w:b/>
+                <w:i w:val="0"/>
+                <w:color w:val="FFFFFF"/>
+                <w:sz w:val="20"/>
+              </w:rPr>
+              <w:t>Item</w:t>
+            </w:r>
+          </w:p>
+        </w:tc>
+        <w:tc>
+          <w:tcPr>
+            <w:tcW w:type="dxa" w:w="2967"/>
+            <w:tcMar>
+              <w:top w:w="60" w:type="dxa"/>
+              <w:bottom w:w="60" w:type="dxa"/>
+              <w:left w:w="100" w:type="dxa"/>
+              <w:right w:w="100" w:type="dxa"/>
+            </w:tcMar>
+            <w:shd w:val="clear" w:color="auto" w:fill="003366"/>
+          </w:tcPr>
+          <w:p>
+            <w:pPr>
+              <w:spacing w:before="40" w:after="40"/>
+            </w:pPr>
+            <w:r>
+              <w:rPr>
+                <w:rFonts w:ascii="Calibri" w:hAnsi="Calibri"/>
+                <w:b/>
+                <w:i w:val="0"/>
+                <w:color w:val="FFFFFF"/>
+                <w:sz w:val="20"/>
+              </w:rPr>
+              <w:t>Fornecedor/Órgão</w:t>
+            </w:r>
+          </w:p>
+        </w:tc>
+        <w:tc>
+          <w:tcPr>
+            <w:tcW w:type="dxa" w:w="2967"/>
+            <w:tcMar>
+              <w:top w:w="60" w:type="dxa"/>
+              <w:bottom w:w="60" w:type="dxa"/>
+              <w:left w:w="100" w:type="dxa"/>
+              <w:right w:w="100" w:type="dxa"/>
+            </w:tcMar>
+            <w:shd w:val="clear" w:color="auto" w:fill="003366"/>
+          </w:tcPr>
+          <w:p>
+            <w:pPr>
+              <w:spacing w:before="40" w:after="40"/>
+            </w:pPr>
+            <w:r>
+              <w:rPr>
+                <w:rFonts w:ascii="Calibri" w:hAnsi="Calibri"/>
+                <w:b/>
+                <w:i w:val="0"/>
+                <w:color w:val="FFFFFF"/>
+                <w:sz w:val="20"/>
+              </w:rPr>
+              <w:t>Valor (R$)</w:t>
+            </w:r>
+          </w:p>
+        </w:tc>
+      </w:tr>
+      <w:tr>
+        <w:trPr>
+          <w:cantSplit w:val="1"/>
+        </w:trPr>
+        <w:tc>
+          <w:tcPr>
+            <w:tcW w:type="dxa" w:w="2967"/>
+            <w:tcMar>
+              <w:top w:w="60" w:type="dxa"/>
+              <w:bottom w:w="60" w:type="dxa"/>
+              <w:left w:w="100" w:type="dxa"/>
+              <w:right w:w="100" w:type="dxa"/>
+            </w:tcMar>
+            <w:shd w:val="clear" w:color="auto" w:fill="EBF5FB"/>
+          </w:tcPr>
+          <w:p>
+            <w:pPr>
+              <w:spacing w:before="40" w:after="40"/>
+            </w:pPr>
+            <w:r>
+              <w:rPr>
+                <w:rFonts w:ascii="Calibri" w:hAnsi="Calibri"/>
+                <w:b w:val="0"/>
+                <w:i w:val="0"/>
+                <w:sz w:val="20"/>
+              </w:rPr>
+              <w:t>Avaliação Oficial Nível C + Cursos CR1 e CR2</w:t>
+            </w:r>
+          </w:p>
+        </w:tc>
+        <w:tc>
+          <w:tcPr>
+            <w:tcW w:type="dxa" w:w="2967"/>
+            <w:tcMar>
+              <w:top w:w="60" w:type="dxa"/>
+              <w:bottom w:w="60" w:type="dxa"/>
+              <w:left w:w="100" w:type="dxa"/>
+              <w:right w:w="100" w:type="dxa"/>
+            </w:tcMar>
+            <w:shd w:val="clear" w:color="auto" w:fill="EBF5FB"/>
+          </w:tcPr>
+          <w:p>
+            <w:pPr>
+              <w:spacing w:before="40" w:after="40"/>
+            </w:pPr>
+            <w:r>
+              <w:rPr>
+                <w:rFonts w:ascii="Calibri" w:hAnsi="Calibri"/>
+                <w:b w:val="0"/>
+                <w:i w:val="0"/>
+                <w:sz w:val="20"/>
+              </w:rPr>
+              <w:t>ASR Consultoria</w:t>
+            </w:r>
+          </w:p>
+        </w:tc>
+        <w:tc>
+          <w:tcPr>
+            <w:tcW w:type="dxa" w:w="2967"/>
+            <w:tcMar>
+              <w:top w:w="60" w:type="dxa"/>
+              <w:bottom w:w="60" w:type="dxa"/>
+              <w:left w:w="100" w:type="dxa"/>
+              <w:right w:w="100" w:type="dxa"/>
+            </w:tcMar>
+            <w:shd w:val="clear" w:color="auto" w:fill="EBF5FB"/>
+          </w:tcPr>
+          <w:p>
+            <w:pPr>
+              <w:spacing w:before="40" w:after="40"/>
+            </w:pPr>
+            <w:r>
+              <w:rPr>
+                <w:rFonts w:ascii="Calibri" w:hAnsi="Calibri"/>
+                <w:b w:val="0"/>
+                <w:i w:val="0"/>
+                <w:sz w:val="20"/>
+              </w:rPr>
+              <w:t>R$ 22.000,00</w:t>
+            </w:r>
+          </w:p>
+        </w:tc>
+      </w:tr>
+      <w:tr>
+        <w:trPr>
+          <w:cantSplit w:val="1"/>
+        </w:trPr>
+        <w:tc>
+          <w:tcPr>
+            <w:tcW w:type="dxa" w:w="2967"/>
+            <w:tcMar>
+              <w:top w:w="60" w:type="dxa"/>
+              <w:bottom w:w="60" w:type="dxa"/>
+              <w:left w:w="100" w:type="dxa"/>
+              <w:right w:w="100" w:type="dxa"/>
+            </w:tcMar>
+          </w:tcPr>
+          <w:p>
+            <w:pPr>
+              <w:spacing w:before="40" w:after="40"/>
+            </w:pPr>
+            <w:r>
+              <w:rPr>
+                <w:rFonts w:ascii="Calibri" w:hAnsi="Calibri"/>
+                <w:b w:val="0"/>
+                <w:i w:val="0"/>
+                <w:sz w:val="20"/>
+              </w:rPr>
+              <w:t>Taxa de avaliação SOFTEX</w:t>
+            </w:r>
+          </w:p>
+        </w:tc>
+        <w:tc>
+          <w:tcPr>
+            <w:tcW w:type="dxa" w:w="2967"/>
+            <w:tcMar>
+              <w:top w:w="60" w:type="dxa"/>
+              <w:bottom w:w="60" w:type="dxa"/>
+              <w:left w:w="100" w:type="dxa"/>
+              <w:right w:w="100" w:type="dxa"/>
+            </w:tcMar>
+          </w:tcPr>
+          <w:p>
+            <w:pPr>
+              <w:spacing w:before="40" w:after="40"/>
+            </w:pPr>
+            <w:r>
+              <w:rPr>
+                <w:rFonts w:ascii="Calibri" w:hAnsi="Calibri"/>
+                <w:b w:val="0"/>
+                <w:i w:val="0"/>
+                <w:sz w:val="20"/>
+              </w:rPr>
+              <w:t>SOFTEX</w:t>
+            </w:r>
+          </w:p>
+        </w:tc>
+        <w:tc>
+          <w:tcPr>
+            <w:tcW w:type="dxa" w:w="2967"/>
+            <w:tcMar>
+              <w:top w:w="60" w:type="dxa"/>
+              <w:bottom w:w="60" w:type="dxa"/>
+              <w:left w:w="100" w:type="dxa"/>
+              <w:right w:w="100" w:type="dxa"/>
+            </w:tcMar>
+          </w:tcPr>
+          <w:p>
+            <w:pPr>
+              <w:spacing w:before="40" w:after="40"/>
+            </w:pPr>
+            <w:r>
+              <w:rPr>
+                <w:rFonts w:ascii="Calibri" w:hAnsi="Calibri"/>
+                <w:b w:val="0"/>
+                <w:i w:val="0"/>
+                <w:sz w:val="20"/>
+              </w:rPr>
+              <w:t>R$ 6.861,00</w:t>
+            </w:r>
+          </w:p>
+        </w:tc>
+      </w:tr>
+      <w:tr>
+        <w:trPr>
+          <w:cantSplit w:val="1"/>
+        </w:trPr>
+        <w:tc>
+          <w:tcPr>
+            <w:tcW w:type="dxa" w:w="2967"/>
+            <w:tcMar>
+              <w:top w:w="60" w:type="dxa"/>
+              <w:bottom w:w="60" w:type="dxa"/>
+              <w:left w:w="100" w:type="dxa"/>
+              <w:right w:w="100" w:type="dxa"/>
+            </w:tcMar>
+            <w:shd w:val="clear" w:color="auto" w:fill="EBF5FB"/>
+          </w:tcPr>
+          <w:p>
+            <w:pPr>
+              <w:spacing w:before="40" w:after="40"/>
+            </w:pPr>
+            <w:r>
+              <w:rPr>
+                <w:rFonts w:ascii="Calibri" w:hAnsi="Calibri"/>
+                <w:b w:val="0"/>
+                <w:i w:val="0"/>
+                <w:sz w:val="20"/>
+              </w:rPr>
+              <w:t>Consultoria MPS (preparação e implantação)</w:t>
+            </w:r>
+          </w:p>
+        </w:tc>
+        <w:tc>
+          <w:tcPr>
+            <w:tcW w:type="dxa" w:w="2967"/>
+            <w:tcMar>
+              <w:top w:w="60" w:type="dxa"/>
+              <w:bottom w:w="60" w:type="dxa"/>
+              <w:left w:w="100" w:type="dxa"/>
+              <w:right w:w="100" w:type="dxa"/>
+            </w:tcMar>
+            <w:shd w:val="clear" w:color="auto" w:fill="EBF5FB"/>
+          </w:tcPr>
+          <w:p>
+            <w:pPr>
+              <w:spacing w:before="40" w:after="40"/>
+            </w:pPr>
+            <w:r>
+              <w:rPr>
+                <w:rFonts w:ascii="Calibri" w:hAnsi="Calibri"/>
+                <w:b w:val="0"/>
+                <w:i w:val="0"/>
+                <w:sz w:val="20"/>
+              </w:rPr>
+              <w:t>Consultor externo</w:t>
+            </w:r>
+          </w:p>
+        </w:tc>
+        <w:tc>
+          <w:tcPr>
+            <w:tcW w:type="dxa" w:w="2967"/>
+            <w:tcMar>
+              <w:top w:w="60" w:type="dxa"/>
+              <w:bottom w:w="60" w:type="dxa"/>
+              <w:left w:w="100" w:type="dxa"/>
+              <w:right w:w="100" w:type="dxa"/>
+            </w:tcMar>
+            <w:shd w:val="clear" w:color="auto" w:fill="EBF5FB"/>
+          </w:tcPr>
+          <w:p>
+            <w:pPr>
+              <w:spacing w:before="40" w:after="40"/>
+            </w:pPr>
+            <w:r>
+              <w:rPr>
+                <w:rFonts w:ascii="Calibri" w:hAnsi="Calibri"/>
+                <w:b w:val="0"/>
+                <w:i w:val="0"/>
+                <w:sz w:val="20"/>
+              </w:rPr>
+              <w:t>R$ 3.500,00</w:t>
+            </w:r>
+          </w:p>
+        </w:tc>
+      </w:tr>
+      <w:tr>
+        <w:trPr>
+          <w:cantSplit w:val="1"/>
+        </w:trPr>
+        <w:tc>
+          <w:tcPr>
+            <w:tcW w:type="dxa" w:w="2967"/>
+            <w:tcMar>
+              <w:top w:w="60" w:type="dxa"/>
+              <w:bottom w:w="60" w:type="dxa"/>
+              <w:left w:w="100" w:type="dxa"/>
+              <w:right w:w="100" w:type="dxa"/>
+            </w:tcMar>
+          </w:tcPr>
+          <w:p>
+            <w:pPr>
+              <w:spacing w:before="40" w:after="40"/>
+            </w:pPr>
+            <w:r>
+              <w:rPr>
+                <w:rFonts w:ascii="Calibri" w:hAnsi="Calibri"/>
+                <w:b/>
+                <w:i w:val="0"/>
+                <w:sz w:val="20"/>
+              </w:rPr>
+              <w:t>Total aprovado</w:t>
+            </w:r>
+          </w:p>
+        </w:tc>
+        <w:tc>
+          <w:tcPr>
+            <w:tcW w:type="dxa" w:w="2967"/>
+            <w:tcMar>
+              <w:top w:w="60" w:type="dxa"/>
+              <w:bottom w:w="60" w:type="dxa"/>
+              <w:left w:w="100" w:type="dxa"/>
+              <w:right w:w="100" w:type="dxa"/>
+            </w:tcMar>
+          </w:tcPr>
+          <w:p>
+            <w:pPr>
+              <w:spacing w:before="40" w:after="40"/>
+            </w:pPr>
+            <w:r>
+              <w:rPr>
+                <w:rFonts w:ascii="Calibri" w:hAnsi="Calibri"/>
+                <w:b/>
+                <w:i w:val="0"/>
+                <w:sz w:val="20"/>
+              </w:rPr>
+              <w:t>R$ 32.361,00</w:t>
+            </w:r>
+          </w:p>
+        </w:tc>
+        <w:tc>
+          <w:tcPr>
+            <w:tcW w:type="dxa" w:w="2967"/>
+            <w:tcMar>
+              <w:top w:w="60" w:type="dxa"/>
+              <w:bottom w:w="60" w:type="dxa"/>
+              <w:left w:w="100" w:type="dxa"/>
+              <w:right w:w="100" w:type="dxa"/>
+            </w:tcMar>
+          </w:tcPr>
+          <w:p>
+            <w:pPr>
+              <w:spacing w:before="40" w:after="40"/>
+            </w:pPr>
+          </w:p>
+        </w:tc>
+      </w:tr>
+    </w:tbl>
+    <w:p>
+      <w:pPr>
+        <w:spacing w:before="0" w:after="160"/>
+      </w:pPr>
+    </w:p>
+    <w:p>
+      <w:pPr>
+        <w:spacing w:before="0" w:after="120"/>
+      </w:pPr>
+      <w:r>
+        <w:rPr>
+          <w:rFonts w:ascii="Calibri" w:hAnsi="Calibri"/>
+          <w:b w:val="0"/>
+          <w:i w:val="0"/>
+          <w:sz w:val="22"/>
+        </w:rPr>
+        <w:t>A aprovação do orçamento é responsabilidade do COO, com ciência do CEO.</w:t>
+      </w:r>
+    </w:p>
+    <w:p>
+      <w:pPr>
+        <w:spacing w:before="0" w:after="120"/>
+      </w:pPr>
+      <w:r>
+        <w:rPr>
+          <w:rFonts w:ascii="Calibri" w:hAnsi="Calibri"/>
+          <w:b w:val="0"/>
+          <w:i w:val="0"/>
+          <w:sz w:val="22"/>
+        </w:rPr>
+        <w:t>A manutenção dos recursos gerais de capacitação é responsabilidade da área de Cultura e Pessoas, com apoio do COO.</w:t>
       </w:r>
     </w:p>
     <w:p>
@@ -2832,6 +3297,112 @@
           </w:p>
         </w:tc>
       </w:tr>
+      <w:tr>
+        <w:trPr>
+          <w:cantSplit w:val="1"/>
+        </w:trPr>
+        <w:tc>
+          <w:tcPr>
+            <w:tcW w:type="dxa" w:w="2225"/>
+            <w:tcMar>
+              <w:top w:w="60" w:type="dxa"/>
+              <w:bottom w:w="60" w:type="dxa"/>
+              <w:left w:w="100" w:type="dxa"/>
+              <w:right w:w="100" w:type="dxa"/>
+            </w:tcMar>
+            <w:shd w:val="clear" w:color="auto" w:fill="F0F4F8"/>
+          </w:tcPr>
+          <w:p>
+            <w:pPr>
+              <w:spacing w:before="40" w:after="40"/>
+            </w:pPr>
+            <w:r>
+              <w:rPr>
+                <w:rFonts w:ascii="Calibri" w:hAnsi="Calibri"/>
+                <w:b/>
+                <w:i w:val="0"/>
+                <w:sz w:val="20"/>
+              </w:rPr>
+              <w:t>1.2</w:t>
+            </w:r>
+          </w:p>
+        </w:tc>
+        <w:tc>
+          <w:tcPr>
+            <w:tcW w:type="dxa" w:w="2225"/>
+            <w:tcMar>
+              <w:top w:w="60" w:type="dxa"/>
+              <w:bottom w:w="60" w:type="dxa"/>
+              <w:left w:w="100" w:type="dxa"/>
+              <w:right w:w="100" w:type="dxa"/>
+            </w:tcMar>
+          </w:tcPr>
+          <w:p>
+            <w:pPr>
+              <w:spacing w:before="40" w:after="40"/>
+            </w:pPr>
+            <w:r>
+              <w:rPr>
+                <w:rFonts w:ascii="Calibri" w:hAnsi="Calibri"/>
+                <w:b w:val="0"/>
+                <w:i w:val="0"/>
+                <w:sz w:val="20"/>
+              </w:rPr>
+              <w:t>13/06/2026</w:t>
+            </w:r>
+          </w:p>
+        </w:tc>
+        <w:tc>
+          <w:tcPr>
+            <w:tcW w:type="dxa" w:w="2225"/>
+            <w:tcMar>
+              <w:top w:w="60" w:type="dxa"/>
+              <w:bottom w:w="60" w:type="dxa"/>
+              <w:left w:w="100" w:type="dxa"/>
+              <w:right w:w="100" w:type="dxa"/>
+            </w:tcMar>
+          </w:tcPr>
+          <w:p>
+            <w:pPr>
+              <w:spacing w:before="40" w:after="40"/>
+            </w:pPr>
+            <w:r>
+              <w:rPr>
+                <w:rFonts w:ascii="Calibri" w:hAnsi="Calibri"/>
+                <w:b w:val="0"/>
+                <w:i w:val="0"/>
+                <w:sz w:val="20"/>
+              </w:rPr>
+              <w:t>Time de Melhoria Contínua</w:t>
+            </w:r>
+          </w:p>
+        </w:tc>
+        <w:tc>
+          <w:tcPr>
+            <w:tcW w:type="dxa" w:w="2225"/>
+            <w:tcMar>
+              <w:top w:w="60" w:type="dxa"/>
+              <w:bottom w:w="60" w:type="dxa"/>
+              <w:left w:w="100" w:type="dxa"/>
+              <w:right w:w="100" w:type="dxa"/>
+            </w:tcMar>
+          </w:tcPr>
+          <w:p>
+            <w:pPr>
+              <w:spacing w:before="40" w:after="40"/>
+            </w:pPr>
+            <w:r>
+              <w:rPr>
+                <w:rFonts w:ascii="Calibri" w:hAnsi="Calibri"/>
+                <w:b w:val="0"/>
+                <w:i w:val="0"/>
+                <w:sz w:val="20"/>
+              </w:rPr>
+              <w:t>Adicionada §6.1 com orçamento detalhado do ciclo MPS-SW Nível C (ASR, SOFTEX, consultoria) — evidência de CAP 4 e OSW 2</w:t>
+            </w:r>
+          </w:p>
+        </w:tc>
+      </w:tr>
     </w:tbl>
     <w:p>
       <w:pPr>
@@ -2872,7 +3443,7 @@
         <w:color w:val="555555"/>
         <w:sz w:val="16"/>
       </w:rPr>
-      <w:t>vData  ·  10/02/2026</w:t>
+      <w:t>vData  ·  13/06/2026</w:t>
     </w:r>
     <w:r>
       <w:tab/>
@@ -2934,7 +3505,7 @@
         <w:color w:val="555555"/>
         <w:sz w:val="16"/>
       </w:rPr>
-      <w:t>vData  ·  10/02/2026</w:t>
+      <w:t>vData  ·  13/06/2026</w:t>
     </w:r>
     <w:r>
       <w:tab/>

</xml_diff>